<commit_message>
Update figures, tables and supplementary material
</commit_message>
<xml_diff>
--- a/Figure 1.docx
+++ b/Figure 1.docx
@@ -27,7 +27,7 @@
         <mc:AlternateContent>
           <mc:Choice Requires="wpg">
             <w:drawing>
-              <wp:anchor distT="0" distB="0" distL="114300" distR="114300" simplePos="0" relativeHeight="251670528" behindDoc="0" locked="0" layoutInCell="1" allowOverlap="1" wp14:anchorId="2DBF6313" wp14:editId="2248A805">
+              <wp:anchor distT="0" distB="0" distL="114300" distR="114300" simplePos="0" relativeHeight="251670528" behindDoc="0" locked="0" layoutInCell="1" allowOverlap="1" wp14:anchorId="2DBF6313" wp14:editId="707227CE">
                 <wp:simplePos x="0" y="0"/>
                 <wp:positionH relativeFrom="column">
                   <wp:posOffset>-6985</wp:posOffset>
@@ -409,7 +409,7 @@
           </mc:Choice>
           <mc:Fallback>
             <w:pict>
-              <v:group w14:anchorId="2DBF6313" id="Group 9" o:spid="_x0000_s1026" style="position:absolute;margin-left:-.55pt;margin-top:21.05pt;width:96pt;height:160.35pt;z-index:251670528;mso-width-relative:margin;mso-height-relative:margin" coordsize="12192,20364" o:gfxdata="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">
+              <v:group w14:anchorId="2DBF6313" id="Group 9" o:spid="_x0000_s1026" style="position:absolute;margin-left:-.55pt;margin-top:21.05pt;width:96pt;height:160.35pt;z-index:251670528;mso-width-relative:margin;mso-height-relative:margin" coordsize="12192,20364" o:gfxdata="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">
                 <v:rect id="Rectangle 3" o:spid="_x0000_s1027" style="position:absolute;width:12192;height:20364;visibility:visible;mso-wrap-style:square;v-text-anchor:middle" o:gfxdata="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" fillcolor="#d9e2f3 [660]" strokecolor="#1f3763 [1604]" strokeweight="1pt">
                   <v:textbox>
                     <w:txbxContent>
@@ -1248,30 +1248,18 @@
                             <w:p>
                               <w:pPr>
                                 <w:jc w:val="center"/>
+                                <w:rPr>
+                                  <w:sz w:val="18"/>
+                                  <w:szCs w:val="18"/>
+                                </w:rPr>
                               </w:pPr>
                               <w:r>
                                 <w:rPr>
                                   <w:color w:val="000000" w:themeColor="text1"/>
-                                  <w:sz w:val="16"/>
-                                  <w:szCs w:val="16"/>
-                                </w:rPr>
-                                <w:t>6</w:t>
-                              </w:r>
-                              <w:r>
-                                <w:rPr>
-                                  <w:color w:val="000000" w:themeColor="text1"/>
-                                  <w:sz w:val="16"/>
-                                  <w:szCs w:val="16"/>
-                                </w:rPr>
-                                <w:t xml:space="preserve"> months</w:t>
-                              </w:r>
-                              <w:r>
-                                <w:rPr>
-                                  <w:color w:val="000000" w:themeColor="text1"/>
-                                  <w:sz w:val="16"/>
-                                  <w:szCs w:val="16"/>
-                                </w:rPr>
-                                <w:t xml:space="preserve"> after surgery</w:t>
+                                  <w:sz w:val="12"/>
+                                  <w:szCs w:val="12"/>
+                                </w:rPr>
+                                <w:t>6 months after surgery</w:t>
                               </w:r>
                             </w:p>
                           </w:txbxContent>
@@ -1547,7 +1535,7 @@
           </mc:Choice>
           <mc:Fallback>
             <w:pict>
-              <v:group w14:anchorId="49F3C7A6" id="Group 63" o:spid="_x0000_s1039" style="position:absolute;margin-left:303.25pt;margin-top:20.55pt;width:66.5pt;height:127.05pt;z-index:251667456" coordsize="8451,16140" o:gfxdata="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">
+              <v:group w14:anchorId="49F3C7A6" id="Group 63" o:spid="_x0000_s1039" style="position:absolute;margin-left:303.25pt;margin-top:20.55pt;width:66.5pt;height:127.05pt;z-index:251667456" coordsize="8451,16140" o:gfxdata="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">
                 <v:rect id="Rectangle 192" o:spid="_x0000_s1040" style="position:absolute;width:8451;height:16140;visibility:visible;mso-wrap-style:square;v-text-anchor:middle" o:gfxdata="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" fillcolor="#d9e2f3 [660]" strokecolor="#1f3763 [1604]" strokeweight="1pt"/>
                 <v:rect id="Rectangle 193" o:spid="_x0000_s1041" style="position:absolute;left:484;top:346;width:7411;height:3464;visibility:visible;mso-wrap-style:square;v-text-anchor:middle" o:gfxdata="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" fillcolor="#deeaf6 [664]" strokecolor="#1f3763 [1604]" strokeweight="1pt">
                   <v:textbox>
@@ -1555,30 +1543,18 @@
                       <w:p>
                         <w:pPr>
                           <w:jc w:val="center"/>
+                          <w:rPr>
+                            <w:sz w:val="18"/>
+                            <w:szCs w:val="18"/>
+                          </w:rPr>
                         </w:pPr>
                         <w:r>
                           <w:rPr>
                             <w:color w:val="000000" w:themeColor="text1"/>
-                            <w:sz w:val="16"/>
-                            <w:szCs w:val="16"/>
-                          </w:rPr>
-                          <w:t>6</w:t>
-                        </w:r>
-                        <w:r>
-                          <w:rPr>
-                            <w:color w:val="000000" w:themeColor="text1"/>
-                            <w:sz w:val="16"/>
-                            <w:szCs w:val="16"/>
-                          </w:rPr>
-                          <w:t xml:space="preserve"> months</w:t>
-                        </w:r>
-                        <w:r>
-                          <w:rPr>
-                            <w:color w:val="000000" w:themeColor="text1"/>
-                            <w:sz w:val="16"/>
-                            <w:szCs w:val="16"/>
-                          </w:rPr>
-                          <w:t xml:space="preserve"> after surgery</w:t>
+                            <w:sz w:val="12"/>
+                            <w:szCs w:val="12"/>
+                          </w:rPr>
+                          <w:t>6 months after surgery</w:t>
                         </w:r>
                       </w:p>
                     </w:txbxContent>
@@ -5124,7 +5100,370 @@
         </mc:AlternateContent>
       </w:r>
     </w:p>
-    <w:p/>
+    <w:p>
+      <w:r>
+        <w:rPr>
+          <w:noProof/>
+        </w:rPr>
+        <mc:AlternateContent>
+          <mc:Choice Requires="wps">
+            <w:drawing>
+              <wp:anchor distT="45720" distB="45720" distL="114300" distR="114300" simplePos="0" relativeHeight="251676672" behindDoc="0" locked="0" layoutInCell="1" allowOverlap="1" wp14:anchorId="362416B7" wp14:editId="1345C7AB">
+                <wp:simplePos x="0" y="0"/>
+                <wp:positionH relativeFrom="column">
+                  <wp:posOffset>5178788</wp:posOffset>
+                </wp:positionH>
+                <wp:positionV relativeFrom="paragraph">
+                  <wp:posOffset>272415</wp:posOffset>
+                </wp:positionV>
+                <wp:extent cx="320675" cy="212090"/>
+                <wp:effectExtent l="0" t="0" r="22225" b="16510"/>
+                <wp:wrapSquare wrapText="bothSides"/>
+                <wp:docPr id="634730390" name="Text Box 2"/>
+                <wp:cNvGraphicFramePr>
+                  <a:graphicFrameLocks xmlns:a="http://schemas.openxmlformats.org/drawingml/2006/main"/>
+                </wp:cNvGraphicFramePr>
+                <a:graphic xmlns:a="http://schemas.openxmlformats.org/drawingml/2006/main">
+                  <a:graphicData uri="http://schemas.microsoft.com/office/word/2010/wordprocessingShape">
+                    <wps:wsp>
+                      <wps:cNvSpPr txBox="1">
+                        <a:spLocks noChangeArrowheads="1"/>
+                      </wps:cNvSpPr>
+                      <wps:spPr bwMode="auto">
+                        <a:xfrm>
+                          <a:off x="0" y="0"/>
+                          <a:ext cx="320675" cy="212090"/>
+                        </a:xfrm>
+                        <a:prstGeom prst="rect">
+                          <a:avLst/>
+                        </a:prstGeom>
+                        <a:solidFill>
+                          <a:srgbClr val="FFFFFF"/>
+                        </a:solidFill>
+                        <a:ln w="9525">
+                          <a:solidFill>
+                            <a:srgbClr val="000000"/>
+                          </a:solidFill>
+                          <a:miter lim="800000"/>
+                          <a:headEnd/>
+                          <a:tailEnd/>
+                        </a:ln>
+                      </wps:spPr>
+                      <wps:txbx>
+                        <w:txbxContent>
+                          <w:p>
+                            <w:pPr>
+                              <w:rPr>
+                                <w:sz w:val="14"/>
+                                <w:szCs w:val="14"/>
+                              </w:rPr>
+                            </w:pPr>
+                            <w:r>
+                              <w:rPr>
+                                <w:sz w:val="14"/>
+                                <w:szCs w:val="14"/>
+                              </w:rPr>
+                              <w:t>Q</w:t>
+                            </w:r>
+                            <w:r>
+                              <w:rPr>
+                                <w:sz w:val="14"/>
+                                <w:szCs w:val="14"/>
+                              </w:rPr>
+                              <w:t>3</w:t>
+                            </w:r>
+                          </w:p>
+                        </w:txbxContent>
+                      </wps:txbx>
+                      <wps:bodyPr rot="0" vert="horz" wrap="square" lIns="91440" tIns="45720" rIns="91440" bIns="45720" anchor="t" anchorCtr="0">
+                        <a:noAutofit/>
+                      </wps:bodyPr>
+                    </wps:wsp>
+                  </a:graphicData>
+                </a:graphic>
+                <wp14:sizeRelH relativeFrom="margin">
+                  <wp14:pctWidth>0</wp14:pctWidth>
+                </wp14:sizeRelH>
+                <wp14:sizeRelV relativeFrom="margin">
+                  <wp14:pctHeight>0</wp14:pctHeight>
+                </wp14:sizeRelV>
+              </wp:anchor>
+            </w:drawing>
+          </mc:Choice>
+          <mc:Fallback>
+            <w:pict>
+              <v:shapetype w14:anchorId="362416B7" id="_x0000_t202" coordsize="21600,21600" o:spt="202" path="m,l,21600r21600,l21600,xe">
+                <v:stroke joinstyle="miter"/>
+                <v:path gradientshapeok="t" o:connecttype="rect"/>
+              </v:shapetype>
+              <v:shape id="Text Box 2" o:spid="_x0000_s1088" type="#_x0000_t202" style="position:absolute;margin-left:407.8pt;margin-top:21.45pt;width:25.25pt;height:16.7pt;z-index:251676672;visibility:visible;mso-wrap-style:square;mso-width-percent:0;mso-height-percent:0;mso-wrap-distance-left:9pt;mso-wrap-distance-top:3.6pt;mso-wrap-distance-right:9pt;mso-wrap-distance-bottom:3.6pt;mso-position-horizontal:absolute;mso-position-horizontal-relative:text;mso-position-vertical:absolute;mso-position-vertical-relative:text;mso-width-percent:0;mso-height-percent:0;mso-width-relative:margin;mso-height-relative:margin;v-text-anchor:top" o:gfxdata="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">
+                <v:textbox>
+                  <w:txbxContent>
+                    <w:p>
+                      <w:pPr>
+                        <w:rPr>
+                          <w:sz w:val="14"/>
+                          <w:szCs w:val="14"/>
+                        </w:rPr>
+                      </w:pPr>
+                      <w:r>
+                        <w:rPr>
+                          <w:sz w:val="14"/>
+                          <w:szCs w:val="14"/>
+                        </w:rPr>
+                        <w:t>Q</w:t>
+                      </w:r>
+                      <w:r>
+                        <w:rPr>
+                          <w:sz w:val="14"/>
+                          <w:szCs w:val="14"/>
+                        </w:rPr>
+                        <w:t>3</w:t>
+                      </w:r>
+                    </w:p>
+                  </w:txbxContent>
+                </v:textbox>
+                <w10:wrap type="square"/>
+              </v:shape>
+            </w:pict>
+          </mc:Fallback>
+        </mc:AlternateContent>
+      </w:r>
+      <w:r>
+        <w:rPr>
+          <w:noProof/>
+        </w:rPr>
+        <mc:AlternateContent>
+          <mc:Choice Requires="wps">
+            <w:drawing>
+              <wp:anchor distT="45720" distB="45720" distL="114300" distR="114300" simplePos="0" relativeHeight="251674624" behindDoc="0" locked="0" layoutInCell="1" allowOverlap="1" wp14:anchorId="492CCD49" wp14:editId="7BFDD2B6">
+                <wp:simplePos x="0" y="0"/>
+                <wp:positionH relativeFrom="column">
+                  <wp:posOffset>4119608</wp:posOffset>
+                </wp:positionH>
+                <wp:positionV relativeFrom="paragraph">
+                  <wp:posOffset>270510</wp:posOffset>
+                </wp:positionV>
+                <wp:extent cx="320675" cy="212090"/>
+                <wp:effectExtent l="0" t="0" r="22225" b="16510"/>
+                <wp:wrapSquare wrapText="bothSides"/>
+                <wp:docPr id="1908720745" name="Text Box 2"/>
+                <wp:cNvGraphicFramePr>
+                  <a:graphicFrameLocks xmlns:a="http://schemas.openxmlformats.org/drawingml/2006/main"/>
+                </wp:cNvGraphicFramePr>
+                <a:graphic xmlns:a="http://schemas.openxmlformats.org/drawingml/2006/main">
+                  <a:graphicData uri="http://schemas.microsoft.com/office/word/2010/wordprocessingShape">
+                    <wps:wsp>
+                      <wps:cNvSpPr txBox="1">
+                        <a:spLocks noChangeArrowheads="1"/>
+                      </wps:cNvSpPr>
+                      <wps:spPr bwMode="auto">
+                        <a:xfrm>
+                          <a:off x="0" y="0"/>
+                          <a:ext cx="320675" cy="212090"/>
+                        </a:xfrm>
+                        <a:prstGeom prst="rect">
+                          <a:avLst/>
+                        </a:prstGeom>
+                        <a:solidFill>
+                          <a:srgbClr val="FFFFFF"/>
+                        </a:solidFill>
+                        <a:ln w="9525">
+                          <a:solidFill>
+                            <a:srgbClr val="000000"/>
+                          </a:solidFill>
+                          <a:miter lim="800000"/>
+                          <a:headEnd/>
+                          <a:tailEnd/>
+                        </a:ln>
+                      </wps:spPr>
+                      <wps:txbx>
+                        <w:txbxContent>
+                          <w:p>
+                            <w:pPr>
+                              <w:rPr>
+                                <w:sz w:val="14"/>
+                                <w:szCs w:val="14"/>
+                              </w:rPr>
+                            </w:pPr>
+                            <w:r>
+                              <w:rPr>
+                                <w:sz w:val="14"/>
+                                <w:szCs w:val="14"/>
+                              </w:rPr>
+                              <w:t>Q</w:t>
+                            </w:r>
+                            <w:r>
+                              <w:rPr>
+                                <w:sz w:val="14"/>
+                                <w:szCs w:val="14"/>
+                              </w:rPr>
+                              <w:t>2</w:t>
+                            </w:r>
+                          </w:p>
+                        </w:txbxContent>
+                      </wps:txbx>
+                      <wps:bodyPr rot="0" vert="horz" wrap="square" lIns="91440" tIns="45720" rIns="91440" bIns="45720" anchor="t" anchorCtr="0">
+                        <a:noAutofit/>
+                      </wps:bodyPr>
+                    </wps:wsp>
+                  </a:graphicData>
+                </a:graphic>
+                <wp14:sizeRelH relativeFrom="margin">
+                  <wp14:pctWidth>0</wp14:pctWidth>
+                </wp14:sizeRelH>
+                <wp14:sizeRelV relativeFrom="margin">
+                  <wp14:pctHeight>0</wp14:pctHeight>
+                </wp14:sizeRelV>
+              </wp:anchor>
+            </w:drawing>
+          </mc:Choice>
+          <mc:Fallback>
+            <w:pict>
+              <v:shape w14:anchorId="492CCD49" id="_x0000_s1089" type="#_x0000_t202" style="position:absolute;margin-left:324.4pt;margin-top:21.3pt;width:25.25pt;height:16.7pt;z-index:251674624;visibility:visible;mso-wrap-style:square;mso-width-percent:0;mso-height-percent:0;mso-wrap-distance-left:9pt;mso-wrap-distance-top:3.6pt;mso-wrap-distance-right:9pt;mso-wrap-distance-bottom:3.6pt;mso-position-horizontal:absolute;mso-position-horizontal-relative:text;mso-position-vertical:absolute;mso-position-vertical-relative:text;mso-width-percent:0;mso-height-percent:0;mso-width-relative:margin;mso-height-relative:margin;v-text-anchor:top" o:gfxdata="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">
+                <v:textbox>
+                  <w:txbxContent>
+                    <w:p>
+                      <w:pPr>
+                        <w:rPr>
+                          <w:sz w:val="14"/>
+                          <w:szCs w:val="14"/>
+                        </w:rPr>
+                      </w:pPr>
+                      <w:r>
+                        <w:rPr>
+                          <w:sz w:val="14"/>
+                          <w:szCs w:val="14"/>
+                        </w:rPr>
+                        <w:t>Q</w:t>
+                      </w:r>
+                      <w:r>
+                        <w:rPr>
+                          <w:sz w:val="14"/>
+                          <w:szCs w:val="14"/>
+                        </w:rPr>
+                        <w:t>2</w:t>
+                      </w:r>
+                    </w:p>
+                  </w:txbxContent>
+                </v:textbox>
+                <w10:wrap type="square"/>
+              </v:shape>
+            </w:pict>
+          </mc:Fallback>
+        </mc:AlternateContent>
+      </w:r>
+      <w:r>
+        <w:rPr>
+          <w:noProof/>
+        </w:rPr>
+        <mc:AlternateContent>
+          <mc:Choice Requires="wps">
+            <w:drawing>
+              <wp:anchor distT="45720" distB="45720" distL="114300" distR="114300" simplePos="0" relativeHeight="251672576" behindDoc="0" locked="0" layoutInCell="1" allowOverlap="1" wp14:anchorId="132B8BD5" wp14:editId="19C4EF23">
+                <wp:simplePos x="0" y="0"/>
+                <wp:positionH relativeFrom="column">
+                  <wp:posOffset>1925320</wp:posOffset>
+                </wp:positionH>
+                <wp:positionV relativeFrom="paragraph">
+                  <wp:posOffset>273413</wp:posOffset>
+                </wp:positionV>
+                <wp:extent cx="320675" cy="212090"/>
+                <wp:effectExtent l="0" t="0" r="22225" b="16510"/>
+                <wp:wrapSquare wrapText="bothSides"/>
+                <wp:docPr id="217" name="Text Box 2"/>
+                <wp:cNvGraphicFramePr>
+                  <a:graphicFrameLocks xmlns:a="http://schemas.openxmlformats.org/drawingml/2006/main"/>
+                </wp:cNvGraphicFramePr>
+                <a:graphic xmlns:a="http://schemas.openxmlformats.org/drawingml/2006/main">
+                  <a:graphicData uri="http://schemas.microsoft.com/office/word/2010/wordprocessingShape">
+                    <wps:wsp>
+                      <wps:cNvSpPr txBox="1">
+                        <a:spLocks noChangeArrowheads="1"/>
+                      </wps:cNvSpPr>
+                      <wps:spPr bwMode="auto">
+                        <a:xfrm>
+                          <a:off x="0" y="0"/>
+                          <a:ext cx="320675" cy="212090"/>
+                        </a:xfrm>
+                        <a:prstGeom prst="rect">
+                          <a:avLst/>
+                        </a:prstGeom>
+                        <a:solidFill>
+                          <a:srgbClr val="FFFFFF"/>
+                        </a:solidFill>
+                        <a:ln w="9525">
+                          <a:solidFill>
+                            <a:srgbClr val="000000"/>
+                          </a:solidFill>
+                          <a:miter lim="800000"/>
+                          <a:headEnd/>
+                          <a:tailEnd/>
+                        </a:ln>
+                      </wps:spPr>
+                      <wps:txbx>
+                        <w:txbxContent>
+                          <w:p>
+                            <w:pPr>
+                              <w:rPr>
+                                <w:sz w:val="14"/>
+                                <w:szCs w:val="14"/>
+                              </w:rPr>
+                            </w:pPr>
+                            <w:r>
+                              <w:rPr>
+                                <w:sz w:val="14"/>
+                                <w:szCs w:val="14"/>
+                              </w:rPr>
+                              <w:t>Q1</w:t>
+                            </w:r>
+                          </w:p>
+                        </w:txbxContent>
+                      </wps:txbx>
+                      <wps:bodyPr rot="0" vert="horz" wrap="square" lIns="91440" tIns="45720" rIns="91440" bIns="45720" anchor="t" anchorCtr="0">
+                        <a:noAutofit/>
+                      </wps:bodyPr>
+                    </wps:wsp>
+                  </a:graphicData>
+                </a:graphic>
+                <wp14:sizeRelH relativeFrom="margin">
+                  <wp14:pctWidth>0</wp14:pctWidth>
+                </wp14:sizeRelH>
+                <wp14:sizeRelV relativeFrom="margin">
+                  <wp14:pctHeight>0</wp14:pctHeight>
+                </wp14:sizeRelV>
+              </wp:anchor>
+            </w:drawing>
+          </mc:Choice>
+          <mc:Fallback>
+            <w:pict>
+              <v:shape w14:anchorId="132B8BD5" id="_x0000_s1090" type="#_x0000_t202" style="position:absolute;margin-left:151.6pt;margin-top:21.55pt;width:25.25pt;height:16.7pt;z-index:251672576;visibility:visible;mso-wrap-style:square;mso-width-percent:0;mso-height-percent:0;mso-wrap-distance-left:9pt;mso-wrap-distance-top:3.6pt;mso-wrap-distance-right:9pt;mso-wrap-distance-bottom:3.6pt;mso-position-horizontal:absolute;mso-position-horizontal-relative:text;mso-position-vertical:absolute;mso-position-vertical-relative:text;mso-width-percent:0;mso-height-percent:0;mso-width-relative:margin;mso-height-relative:margin;v-text-anchor:top" o:gfxdata="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">
+                <v:textbox>
+                  <w:txbxContent>
+                    <w:p>
+                      <w:pPr>
+                        <w:rPr>
+                          <w:sz w:val="14"/>
+                          <w:szCs w:val="14"/>
+                        </w:rPr>
+                      </w:pPr>
+                      <w:r>
+                        <w:rPr>
+                          <w:sz w:val="14"/>
+                          <w:szCs w:val="14"/>
+                        </w:rPr>
+                        <w:t>Q1</w:t>
+                      </w:r>
+                    </w:p>
+                  </w:txbxContent>
+                </v:textbox>
+                <w10:wrap type="square"/>
+              </v:shape>
+            </w:pict>
+          </mc:Fallback>
+        </mc:AlternateContent>
+      </w:r>
+    </w:p>
     <w:p/>
     <w:p>
       <w:r>
@@ -5134,7 +5473,7 @@
         <mc:AlternateContent>
           <mc:Choice Requires="wps">
             <w:drawing>
-              <wp:anchor distT="0" distB="0" distL="114300" distR="114300" simplePos="0" relativeHeight="251659264" behindDoc="1" locked="0" layoutInCell="1" allowOverlap="1" wp14:anchorId="568CA479" wp14:editId="6C8EA05A">
+              <wp:anchor distT="0" distB="0" distL="114300" distR="114300" simplePos="0" relativeHeight="251659264" behindDoc="1" locked="0" layoutInCell="1" allowOverlap="1" wp14:anchorId="568CA479" wp14:editId="519FBA49">
                 <wp:simplePos x="0" y="0"/>
                 <wp:positionH relativeFrom="column">
                   <wp:posOffset>1274618</wp:posOffset>
@@ -5196,7 +5535,23 @@
           </mc:Choice>
           <mc:Fallback>
             <w:pict>
-              <v:shape w14:anchorId="042D887D" id="Arrow: Right 17" o:spid="_x0000_s1026" type="#_x0000_t13" style="position:absolute;margin-left:100.35pt;margin-top:15.75pt;width:380.7pt;height:9.95pt;z-index:-251657216;visibility:visible;mso-wrap-style:square;mso-width-percent:0;mso-height-percent:0;mso-wrap-distance-left:9pt;mso-wrap-distance-top:0;mso-wrap-distance-right:9pt;mso-wrap-distance-bottom:0;mso-position-horizontal:absolute;mso-position-horizontal-relative:text;mso-position-vertical:absolute;mso-position-vertical-relative:text;mso-width-percent:0;mso-height-percent:0;mso-width-relative:margin;mso-height-relative:margin;v-text-anchor:middle" o:gfxdata="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" adj="21318" fillcolor="#4472c4 [3204]" strokecolor="#1f3763 [1604]" strokeweight="1pt"/>
+              <v:shapetype w14:anchorId="32A56ECC" id="_x0000_t13" coordsize="21600,21600" o:spt="13" adj="16200,5400" path="m@0,l@0@1,0@1,0@2@0@2@0,21600,21600,10800xe">
+                <v:stroke joinstyle="miter"/>
+                <v:formulas>
+                  <v:f eqn="val #0"/>
+                  <v:f eqn="val #1"/>
+                  <v:f eqn="sum height 0 #1"/>
+                  <v:f eqn="sum 10800 0 #1"/>
+                  <v:f eqn="sum width 0 #0"/>
+                  <v:f eqn="prod @4 @3 10800"/>
+                  <v:f eqn="sum width 0 @5"/>
+                </v:formulas>
+                <v:path o:connecttype="custom" o:connectlocs="@0,0;0,10800;@0,21600;21600,10800" o:connectangles="270,180,90,0" textboxrect="0,@1,@6,@2"/>
+                <v:handles>
+                  <v:h position="#0,#1" xrange="0,21600" yrange="0,10800"/>
+                </v:handles>
+              </v:shapetype>
+              <v:shape id="Arrow: Right 17" o:spid="_x0000_s1026" type="#_x0000_t13" style="position:absolute;margin-left:100.35pt;margin-top:15.75pt;width:380.7pt;height:9.95pt;z-index:-251657216;visibility:visible;mso-wrap-style:square;mso-width-percent:0;mso-height-percent:0;mso-wrap-distance-left:9pt;mso-wrap-distance-top:0;mso-wrap-distance-right:9pt;mso-wrap-distance-bottom:0;mso-position-horizontal:absolute;mso-position-horizontal-relative:text;mso-position-vertical:absolute;mso-position-vertical-relative:text;mso-width-percent:0;mso-height-percent:0;mso-width-relative:margin;mso-height-relative:margin;v-text-anchor:middle" o:gfxdata="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" adj="21318" fillcolor="#4472c4 [3204]" strokecolor="#1f3763 [1604]" strokeweight="1pt"/>
             </w:pict>
           </mc:Fallback>
         </mc:AlternateContent>
@@ -5206,7 +5561,504 @@
     <w:p/>
     <w:p/>
     <w:p/>
-    <w:p/>
+    <w:p>
+      <w:r>
+        <w:rPr>
+          <w:noProof/>
+        </w:rPr>
+        <mc:AlternateContent>
+          <mc:Choice Requires="wps">
+            <w:drawing>
+              <wp:anchor distT="45720" distB="45720" distL="114300" distR="114300" simplePos="0" relativeHeight="251684864" behindDoc="0" locked="0" layoutInCell="1" allowOverlap="1" wp14:anchorId="77241F90" wp14:editId="4A53D504">
+                <wp:simplePos x="0" y="0"/>
+                <wp:positionH relativeFrom="column">
+                  <wp:posOffset>1935117</wp:posOffset>
+                </wp:positionH>
+                <wp:positionV relativeFrom="paragraph">
+                  <wp:posOffset>116205</wp:posOffset>
+                </wp:positionV>
+                <wp:extent cx="320675" cy="212090"/>
+                <wp:effectExtent l="0" t="0" r="22225" b="16510"/>
+                <wp:wrapSquare wrapText="bothSides"/>
+                <wp:docPr id="1631143144" name="Text Box 2"/>
+                <wp:cNvGraphicFramePr>
+                  <a:graphicFrameLocks xmlns:a="http://schemas.openxmlformats.org/drawingml/2006/main"/>
+                </wp:cNvGraphicFramePr>
+                <a:graphic xmlns:a="http://schemas.openxmlformats.org/drawingml/2006/main">
+                  <a:graphicData uri="http://schemas.microsoft.com/office/word/2010/wordprocessingShape">
+                    <wps:wsp>
+                      <wps:cNvSpPr txBox="1">
+                        <a:spLocks noChangeArrowheads="1"/>
+                      </wps:cNvSpPr>
+                      <wps:spPr bwMode="auto">
+                        <a:xfrm>
+                          <a:off x="0" y="0"/>
+                          <a:ext cx="320675" cy="212090"/>
+                        </a:xfrm>
+                        <a:prstGeom prst="rect">
+                          <a:avLst/>
+                        </a:prstGeom>
+                        <a:solidFill>
+                          <a:srgbClr val="FFFFFF"/>
+                        </a:solidFill>
+                        <a:ln w="9525">
+                          <a:solidFill>
+                            <a:srgbClr val="000000"/>
+                          </a:solidFill>
+                          <a:miter lim="800000"/>
+                          <a:headEnd/>
+                          <a:tailEnd/>
+                        </a:ln>
+                      </wps:spPr>
+                      <wps:txbx>
+                        <w:txbxContent>
+                          <w:p>
+                            <w:pPr>
+                              <w:rPr>
+                                <w:sz w:val="14"/>
+                                <w:szCs w:val="14"/>
+                              </w:rPr>
+                            </w:pPr>
+                            <w:r>
+                              <w:rPr>
+                                <w:sz w:val="14"/>
+                                <w:szCs w:val="14"/>
+                              </w:rPr>
+                              <w:t>Q</w:t>
+                            </w:r>
+                            <w:r>
+                              <w:rPr>
+                                <w:sz w:val="14"/>
+                                <w:szCs w:val="14"/>
+                              </w:rPr>
+                              <w:t>3</w:t>
+                            </w:r>
+                          </w:p>
+                        </w:txbxContent>
+                      </wps:txbx>
+                      <wps:bodyPr rot="0" vert="horz" wrap="square" lIns="91440" tIns="45720" rIns="91440" bIns="45720" anchor="t" anchorCtr="0">
+                        <a:noAutofit/>
+                      </wps:bodyPr>
+                    </wps:wsp>
+                  </a:graphicData>
+                </a:graphic>
+                <wp14:sizeRelH relativeFrom="margin">
+                  <wp14:pctWidth>0</wp14:pctWidth>
+                </wp14:sizeRelH>
+                <wp14:sizeRelV relativeFrom="margin">
+                  <wp14:pctHeight>0</wp14:pctHeight>
+                </wp14:sizeRelV>
+              </wp:anchor>
+            </w:drawing>
+          </mc:Choice>
+          <mc:Fallback>
+            <w:pict>
+              <v:shape w14:anchorId="77241F90" id="_x0000_s1091" type="#_x0000_t202" style="position:absolute;margin-left:152.35pt;margin-top:9.15pt;width:25.25pt;height:16.7pt;z-index:251684864;visibility:visible;mso-wrap-style:square;mso-width-percent:0;mso-height-percent:0;mso-wrap-distance-left:9pt;mso-wrap-distance-top:3.6pt;mso-wrap-distance-right:9pt;mso-wrap-distance-bottom:3.6pt;mso-position-horizontal:absolute;mso-position-horizontal-relative:text;mso-position-vertical:absolute;mso-position-vertical-relative:text;mso-width-percent:0;mso-height-percent:0;mso-width-relative:margin;mso-height-relative:margin;v-text-anchor:top" o:gfxdata="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">
+                <v:textbox>
+                  <w:txbxContent>
+                    <w:p>
+                      <w:pPr>
+                        <w:rPr>
+                          <w:sz w:val="14"/>
+                          <w:szCs w:val="14"/>
+                        </w:rPr>
+                      </w:pPr>
+                      <w:r>
+                        <w:rPr>
+                          <w:sz w:val="14"/>
+                          <w:szCs w:val="14"/>
+                        </w:rPr>
+                        <w:t>Q</w:t>
+                      </w:r>
+                      <w:r>
+                        <w:rPr>
+                          <w:sz w:val="14"/>
+                          <w:szCs w:val="14"/>
+                        </w:rPr>
+                        <w:t>3</w:t>
+                      </w:r>
+                    </w:p>
+                  </w:txbxContent>
+                </v:textbox>
+                <w10:wrap type="square"/>
+              </v:shape>
+            </w:pict>
+          </mc:Fallback>
+        </mc:AlternateContent>
+      </w:r>
+      <w:r>
+        <w:rPr>
+          <w:noProof/>
+        </w:rPr>
+        <mc:AlternateContent>
+          <mc:Choice Requires="wps">
+            <w:drawing>
+              <wp:anchor distT="45720" distB="45720" distL="114300" distR="114300" simplePos="0" relativeHeight="251682816" behindDoc="0" locked="0" layoutInCell="1" allowOverlap="1" wp14:anchorId="24DE786B" wp14:editId="5BD72383">
+                <wp:simplePos x="0" y="0"/>
+                <wp:positionH relativeFrom="column">
+                  <wp:posOffset>3043464</wp:posOffset>
+                </wp:positionH>
+                <wp:positionV relativeFrom="paragraph">
+                  <wp:posOffset>118745</wp:posOffset>
+                </wp:positionV>
+                <wp:extent cx="320675" cy="212090"/>
+                <wp:effectExtent l="0" t="0" r="22225" b="16510"/>
+                <wp:wrapSquare wrapText="bothSides"/>
+                <wp:docPr id="720863307" name="Text Box 2"/>
+                <wp:cNvGraphicFramePr>
+                  <a:graphicFrameLocks xmlns:a="http://schemas.openxmlformats.org/drawingml/2006/main"/>
+                </wp:cNvGraphicFramePr>
+                <a:graphic xmlns:a="http://schemas.openxmlformats.org/drawingml/2006/main">
+                  <a:graphicData uri="http://schemas.microsoft.com/office/word/2010/wordprocessingShape">
+                    <wps:wsp>
+                      <wps:cNvSpPr txBox="1">
+                        <a:spLocks noChangeArrowheads="1"/>
+                      </wps:cNvSpPr>
+                      <wps:spPr bwMode="auto">
+                        <a:xfrm>
+                          <a:off x="0" y="0"/>
+                          <a:ext cx="320675" cy="212090"/>
+                        </a:xfrm>
+                        <a:prstGeom prst="rect">
+                          <a:avLst/>
+                        </a:prstGeom>
+                        <a:solidFill>
+                          <a:srgbClr val="FFFFFF"/>
+                        </a:solidFill>
+                        <a:ln w="9525">
+                          <a:solidFill>
+                            <a:srgbClr val="000000"/>
+                          </a:solidFill>
+                          <a:miter lim="800000"/>
+                          <a:headEnd/>
+                          <a:tailEnd/>
+                        </a:ln>
+                      </wps:spPr>
+                      <wps:txbx>
+                        <w:txbxContent>
+                          <w:p>
+                            <w:pPr>
+                              <w:rPr>
+                                <w:sz w:val="14"/>
+                                <w:szCs w:val="14"/>
+                              </w:rPr>
+                            </w:pPr>
+                            <w:r>
+                              <w:rPr>
+                                <w:sz w:val="14"/>
+                                <w:szCs w:val="14"/>
+                              </w:rPr>
+                              <w:t>Q</w:t>
+                            </w:r>
+                            <w:r>
+                              <w:rPr>
+                                <w:sz w:val="14"/>
+                                <w:szCs w:val="14"/>
+                              </w:rPr>
+                              <w:t>3</w:t>
+                            </w:r>
+                          </w:p>
+                        </w:txbxContent>
+                      </wps:txbx>
+                      <wps:bodyPr rot="0" vert="horz" wrap="square" lIns="91440" tIns="45720" rIns="91440" bIns="45720" anchor="t" anchorCtr="0">
+                        <a:noAutofit/>
+                      </wps:bodyPr>
+                    </wps:wsp>
+                  </a:graphicData>
+                </a:graphic>
+                <wp14:sizeRelH relativeFrom="margin">
+                  <wp14:pctWidth>0</wp14:pctWidth>
+                </wp14:sizeRelH>
+                <wp14:sizeRelV relativeFrom="margin">
+                  <wp14:pctHeight>0</wp14:pctHeight>
+                </wp14:sizeRelV>
+              </wp:anchor>
+            </w:drawing>
+          </mc:Choice>
+          <mc:Fallback>
+            <w:pict>
+              <v:shape w14:anchorId="24DE786B" id="_x0000_s1092" type="#_x0000_t202" style="position:absolute;margin-left:239.65pt;margin-top:9.35pt;width:25.25pt;height:16.7pt;z-index:251682816;visibility:visible;mso-wrap-style:square;mso-width-percent:0;mso-height-percent:0;mso-wrap-distance-left:9pt;mso-wrap-distance-top:3.6pt;mso-wrap-distance-right:9pt;mso-wrap-distance-bottom:3.6pt;mso-position-horizontal:absolute;mso-position-horizontal-relative:text;mso-position-vertical:absolute;mso-position-vertical-relative:text;mso-width-percent:0;mso-height-percent:0;mso-width-relative:margin;mso-height-relative:margin;v-text-anchor:top" o:gfxdata="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">
+                <v:textbox>
+                  <w:txbxContent>
+                    <w:p>
+                      <w:pPr>
+                        <w:rPr>
+                          <w:sz w:val="14"/>
+                          <w:szCs w:val="14"/>
+                        </w:rPr>
+                      </w:pPr>
+                      <w:r>
+                        <w:rPr>
+                          <w:sz w:val="14"/>
+                          <w:szCs w:val="14"/>
+                        </w:rPr>
+                        <w:t>Q</w:t>
+                      </w:r>
+                      <w:r>
+                        <w:rPr>
+                          <w:sz w:val="14"/>
+                          <w:szCs w:val="14"/>
+                        </w:rPr>
+                        <w:t>3</w:t>
+                      </w:r>
+                    </w:p>
+                  </w:txbxContent>
+                </v:textbox>
+                <w10:wrap type="square"/>
+              </v:shape>
+            </w:pict>
+          </mc:Fallback>
+        </mc:AlternateContent>
+      </w:r>
+      <w:r>
+        <w:rPr>
+          <w:noProof/>
+        </w:rPr>
+        <mc:AlternateContent>
+          <mc:Choice Requires="wps">
+            <w:drawing>
+              <wp:anchor distT="45720" distB="45720" distL="114300" distR="114300" simplePos="0" relativeHeight="251680768" behindDoc="0" locked="0" layoutInCell="1" allowOverlap="1" wp14:anchorId="013855B0" wp14:editId="756A3BBF">
+                <wp:simplePos x="0" y="0"/>
+                <wp:positionH relativeFrom="column">
+                  <wp:posOffset>4137297</wp:posOffset>
+                </wp:positionH>
+                <wp:positionV relativeFrom="paragraph">
+                  <wp:posOffset>117475</wp:posOffset>
+                </wp:positionV>
+                <wp:extent cx="320675" cy="212090"/>
+                <wp:effectExtent l="0" t="0" r="22225" b="16510"/>
+                <wp:wrapSquare wrapText="bothSides"/>
+                <wp:docPr id="1332652235" name="Text Box 2"/>
+                <wp:cNvGraphicFramePr>
+                  <a:graphicFrameLocks xmlns:a="http://schemas.openxmlformats.org/drawingml/2006/main"/>
+                </wp:cNvGraphicFramePr>
+                <a:graphic xmlns:a="http://schemas.openxmlformats.org/drawingml/2006/main">
+                  <a:graphicData uri="http://schemas.microsoft.com/office/word/2010/wordprocessingShape">
+                    <wps:wsp>
+                      <wps:cNvSpPr txBox="1">
+                        <a:spLocks noChangeArrowheads="1"/>
+                      </wps:cNvSpPr>
+                      <wps:spPr bwMode="auto">
+                        <a:xfrm>
+                          <a:off x="0" y="0"/>
+                          <a:ext cx="320675" cy="212090"/>
+                        </a:xfrm>
+                        <a:prstGeom prst="rect">
+                          <a:avLst/>
+                        </a:prstGeom>
+                        <a:solidFill>
+                          <a:srgbClr val="FFFFFF"/>
+                        </a:solidFill>
+                        <a:ln w="9525">
+                          <a:solidFill>
+                            <a:srgbClr val="000000"/>
+                          </a:solidFill>
+                          <a:miter lim="800000"/>
+                          <a:headEnd/>
+                          <a:tailEnd/>
+                        </a:ln>
+                      </wps:spPr>
+                      <wps:txbx>
+                        <w:txbxContent>
+                          <w:p>
+                            <w:pPr>
+                              <w:rPr>
+                                <w:sz w:val="14"/>
+                                <w:szCs w:val="14"/>
+                              </w:rPr>
+                            </w:pPr>
+                            <w:r>
+                              <w:rPr>
+                                <w:sz w:val="14"/>
+                                <w:szCs w:val="14"/>
+                              </w:rPr>
+                              <w:t>Q</w:t>
+                            </w:r>
+                            <w:r>
+                              <w:rPr>
+                                <w:sz w:val="14"/>
+                                <w:szCs w:val="14"/>
+                              </w:rPr>
+                              <w:t>3</w:t>
+                            </w:r>
+                          </w:p>
+                        </w:txbxContent>
+                      </wps:txbx>
+                      <wps:bodyPr rot="0" vert="horz" wrap="square" lIns="91440" tIns="45720" rIns="91440" bIns="45720" anchor="t" anchorCtr="0">
+                        <a:noAutofit/>
+                      </wps:bodyPr>
+                    </wps:wsp>
+                  </a:graphicData>
+                </a:graphic>
+                <wp14:sizeRelH relativeFrom="margin">
+                  <wp14:pctWidth>0</wp14:pctWidth>
+                </wp14:sizeRelH>
+                <wp14:sizeRelV relativeFrom="margin">
+                  <wp14:pctHeight>0</wp14:pctHeight>
+                </wp14:sizeRelV>
+              </wp:anchor>
+            </w:drawing>
+          </mc:Choice>
+          <mc:Fallback>
+            <w:pict>
+              <v:shape w14:anchorId="013855B0" id="_x0000_s1093" type="#_x0000_t202" style="position:absolute;margin-left:325.75pt;margin-top:9.25pt;width:25.25pt;height:16.7pt;z-index:251680768;visibility:visible;mso-wrap-style:square;mso-width-percent:0;mso-height-percent:0;mso-wrap-distance-left:9pt;mso-wrap-distance-top:3.6pt;mso-wrap-distance-right:9pt;mso-wrap-distance-bottom:3.6pt;mso-position-horizontal:absolute;mso-position-horizontal-relative:text;mso-position-vertical:absolute;mso-position-vertical-relative:text;mso-width-percent:0;mso-height-percent:0;mso-width-relative:margin;mso-height-relative:margin;v-text-anchor:top" o:gfxdata="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">
+                <v:textbox>
+                  <w:txbxContent>
+                    <w:p>
+                      <w:pPr>
+                        <w:rPr>
+                          <w:sz w:val="14"/>
+                          <w:szCs w:val="14"/>
+                        </w:rPr>
+                      </w:pPr>
+                      <w:r>
+                        <w:rPr>
+                          <w:sz w:val="14"/>
+                          <w:szCs w:val="14"/>
+                        </w:rPr>
+                        <w:t>Q</w:t>
+                      </w:r>
+                      <w:r>
+                        <w:rPr>
+                          <w:sz w:val="14"/>
+                          <w:szCs w:val="14"/>
+                        </w:rPr>
+                        <w:t>3</w:t>
+                      </w:r>
+                    </w:p>
+                  </w:txbxContent>
+                </v:textbox>
+                <w10:wrap type="square"/>
+              </v:shape>
+            </w:pict>
+          </mc:Fallback>
+        </mc:AlternateContent>
+      </w:r>
+      <w:r>
+        <w:rPr>
+          <w:noProof/>
+        </w:rPr>
+        <mc:AlternateContent>
+          <mc:Choice Requires="wps">
+            <w:drawing>
+              <wp:anchor distT="45720" distB="45720" distL="114300" distR="114300" simplePos="0" relativeHeight="251678720" behindDoc="0" locked="0" layoutInCell="1" allowOverlap="1" wp14:anchorId="03F1B4B8" wp14:editId="7789C136">
+                <wp:simplePos x="0" y="0"/>
+                <wp:positionH relativeFrom="column">
+                  <wp:posOffset>5174615</wp:posOffset>
+                </wp:positionH>
+                <wp:positionV relativeFrom="paragraph">
+                  <wp:posOffset>117747</wp:posOffset>
+                </wp:positionV>
+                <wp:extent cx="320675" cy="212090"/>
+                <wp:effectExtent l="0" t="0" r="22225" b="16510"/>
+                <wp:wrapSquare wrapText="bothSides"/>
+                <wp:docPr id="1900965056" name="Text Box 2"/>
+                <wp:cNvGraphicFramePr>
+                  <a:graphicFrameLocks xmlns:a="http://schemas.openxmlformats.org/drawingml/2006/main"/>
+                </wp:cNvGraphicFramePr>
+                <a:graphic xmlns:a="http://schemas.openxmlformats.org/drawingml/2006/main">
+                  <a:graphicData uri="http://schemas.microsoft.com/office/word/2010/wordprocessingShape">
+                    <wps:wsp>
+                      <wps:cNvSpPr txBox="1">
+                        <a:spLocks noChangeArrowheads="1"/>
+                      </wps:cNvSpPr>
+                      <wps:spPr bwMode="auto">
+                        <a:xfrm>
+                          <a:off x="0" y="0"/>
+                          <a:ext cx="320675" cy="212090"/>
+                        </a:xfrm>
+                        <a:prstGeom prst="rect">
+                          <a:avLst/>
+                        </a:prstGeom>
+                        <a:solidFill>
+                          <a:srgbClr val="FFFFFF"/>
+                        </a:solidFill>
+                        <a:ln w="9525">
+                          <a:solidFill>
+                            <a:srgbClr val="000000"/>
+                          </a:solidFill>
+                          <a:miter lim="800000"/>
+                          <a:headEnd/>
+                          <a:tailEnd/>
+                        </a:ln>
+                      </wps:spPr>
+                      <wps:txbx>
+                        <w:txbxContent>
+                          <w:p>
+                            <w:pPr>
+                              <w:rPr>
+                                <w:sz w:val="14"/>
+                                <w:szCs w:val="14"/>
+                              </w:rPr>
+                            </w:pPr>
+                            <w:r>
+                              <w:rPr>
+                                <w:sz w:val="14"/>
+                                <w:szCs w:val="14"/>
+                              </w:rPr>
+                              <w:t>Q</w:t>
+                            </w:r>
+                            <w:r>
+                              <w:rPr>
+                                <w:sz w:val="14"/>
+                                <w:szCs w:val="14"/>
+                              </w:rPr>
+                              <w:t>3</w:t>
+                            </w:r>
+                          </w:p>
+                        </w:txbxContent>
+                      </wps:txbx>
+                      <wps:bodyPr rot="0" vert="horz" wrap="square" lIns="91440" tIns="45720" rIns="91440" bIns="45720" anchor="t" anchorCtr="0">
+                        <a:noAutofit/>
+                      </wps:bodyPr>
+                    </wps:wsp>
+                  </a:graphicData>
+                </a:graphic>
+                <wp14:sizeRelH relativeFrom="margin">
+                  <wp14:pctWidth>0</wp14:pctWidth>
+                </wp14:sizeRelH>
+                <wp14:sizeRelV relativeFrom="margin">
+                  <wp14:pctHeight>0</wp14:pctHeight>
+                </wp14:sizeRelV>
+              </wp:anchor>
+            </w:drawing>
+          </mc:Choice>
+          <mc:Fallback>
+            <w:pict>
+              <v:shape w14:anchorId="03F1B4B8" id="_x0000_s1094" type="#_x0000_t202" style="position:absolute;margin-left:407.45pt;margin-top:9.25pt;width:25.25pt;height:16.7pt;z-index:251678720;visibility:visible;mso-wrap-style:square;mso-width-percent:0;mso-height-percent:0;mso-wrap-distance-left:9pt;mso-wrap-distance-top:3.6pt;mso-wrap-distance-right:9pt;mso-wrap-distance-bottom:3.6pt;mso-position-horizontal:absolute;mso-position-horizontal-relative:text;mso-position-vertical:absolute;mso-position-vertical-relative:text;mso-width-percent:0;mso-height-percent:0;mso-width-relative:margin;mso-height-relative:margin;v-text-anchor:top" o:gfxdata="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">
+                <v:textbox>
+                  <w:txbxContent>
+                    <w:p>
+                      <w:pPr>
+                        <w:rPr>
+                          <w:sz w:val="14"/>
+                          <w:szCs w:val="14"/>
+                        </w:rPr>
+                      </w:pPr>
+                      <w:r>
+                        <w:rPr>
+                          <w:sz w:val="14"/>
+                          <w:szCs w:val="14"/>
+                        </w:rPr>
+                        <w:t>Q</w:t>
+                      </w:r>
+                      <w:r>
+                        <w:rPr>
+                          <w:sz w:val="14"/>
+                          <w:szCs w:val="14"/>
+                        </w:rPr>
+                        <w:t>3</w:t>
+                      </w:r>
+                    </w:p>
+                  </w:txbxContent>
+                </v:textbox>
+                <w10:wrap type="square"/>
+              </v:shape>
+            </w:pict>
+          </mc:Fallback>
+        </mc:AlternateContent>
+      </w:r>
+    </w:p>
     <w:p/>
     <w:p/>
     <w:p/>

</xml_diff>